<commit_message>
Remove dead code, refresh screenshots, delete docs utilities
- Remove 3 unused functions from couchbase_client.py (get_processed_deliveries,
  vector_search, search_deliveries) and unused typing import
- Remove 3 unused functions + 2 unused dicts from styles.py (ai_badge,
  event_icon, event_color, _EVENT_ICONS, _EVENT_COLORS)
- Remove unused EMBEDDING_DIMS constant from config.py
- Refresh all 6 walkthrough screenshots and rebuild .docx
- Delete docs/ utility scripts (debug_tabs.py, capture_screenshots.py,
  build_walkthrough.py) after final run

🤖 Generated with [Qoder][https://qoder.com]
</commit_message>
<xml_diff>
--- a/docs/SmartDelivery_Walkthrough.docx
+++ b/docs/SmartDelivery_Walkthrough.docx
@@ -289,11 +289,11 @@
               <a:graphicData uri="http://schemas.openxmlformats.org/drawingml/2006/picture">
                 <pic:pic>
                   <pic:nvPicPr>
-                    <pic:cNvPr id="0" name="walkthrough_03_command_center.png"/>
+                    <pic:cNvPr id="0" name="walkthrough_04_pipeline_pii.png"/>
                     <pic:cNvPicPr/>
                   </pic:nvPicPr>
                   <pic:blipFill>
-                    <a:blip r:embed="rId10"/>
+                    <a:blip r:embed="rId11"/>
                     <a:stretch>
                       <a:fillRect/>
                     </a:stretch>
@@ -358,11 +358,11 @@
               <a:graphicData uri="http://schemas.openxmlformats.org/drawingml/2006/picture">
                 <pic:pic>
                   <pic:nvPicPr>
-                    <pic:cNvPr id="0" name="walkthrough_03_command_center.png"/>
+                    <pic:cNvPr id="0" name="walkthrough_04_pipeline_pii.png"/>
                     <pic:cNvPicPr/>
                   </pic:nvPicPr>
                   <pic:blipFill>
-                    <a:blip r:embed="rId10"/>
+                    <a:blip r:embed="rId11"/>
                     <a:stretch>
                       <a:fillRect/>
                     </a:stretch>
@@ -431,7 +431,7 @@
                     <pic:cNvPicPr/>
                   </pic:nvPicPr>
                   <pic:blipFill>
-                    <a:blip r:embed="rId11"/>
+                    <a:blip r:embed="rId12"/>
                     <a:stretch>
                       <a:fillRect/>
                     </a:stretch>

</xml_diff>